<commit_message>
docs: viết lại HDSD theo luồng mới + 15 hình minh họa cập nhật
HDSD_H2_2026_Teamlead_NhanSu.docx phản ánh luồng 2026-09:
- Đăng ký US tối giản 1 bước (Workflow→US + Action Plan T9–T12)
- "Cập nhật US" (thay "Cập nhật tuần"): prompt/luồng AI + demo + kế hoạch + số liệu
- US H1 (tra cứu chỉ đọc + lọc + modal chi tiết); Bài tập AI (không KPI)
- Tự chấm KPI (member KPI2/KPI3 + khai lan tỏa KPI4) → Teamlead Duyệt chấm điểm
- Cập nhật bảng công thức KPI + FAQ theo luồng mới

Bộ chụp ảnh (zz-capture-h2-guide.spec.js): +mock h1-list/exercise-list/self-score-*/
sharing-claim-list, điều hướng SPA qua hash → 15 ảnh mới phản ánh UI mới (FA + search-box + badge token).
build_h2_guide.py giữ engine, đổi nội dung + tên ảnh. Capture 4/4 PASS; docx nhúng 15 ảnh.

Co-Authored-By: Claude Opus 4.8 <noreply@anthropic.com>
Claude-Session: https://claude.ai/code/session_01XkfqNNGdSZPU1CuXK6v19C
</commit_message>
<xml_diff>
--- a/HDSD_H2_2026_Teamlead_NhanSu.docx
+++ b/HDSD_H2_2026_Teamlead_NhanSu.docx
@@ -49,7 +49,7 @@
           <w:color w:val="6B7280"/>
           <w:sz w:val="20"/>
         </w:rPr>
-        <w:t>Cập nhật: 26/08/2026</w:t>
+        <w:t>Cập nhật: 14/09/2026 · luồng mới (đăng ký tối giản · Tự chấm KPI → Teamlead duyệt)</w:t>
       </w:r>
     </w:p>
     <w:p/>
@@ -70,7 +70,60 @@
           <w:b w:val="0"/>
           <w:sz w:val="22"/>
         </w:rPr>
-        <w:t>Nền tảng ghi nhận và quản trị việc ứng dụng AI trong công việc theo chương trình "Bình dân hóa AI" nửa cuối 2026 (H2). Mỗi cá nhân đăng ký Use Case AI, cập nhật tiến độ; hội đồng và teamlead chấm điểm; hệ thống tổng hợp KPI và xếp hạng.</w:t>
+        <w:t>Nền tảng ghi nhận và quản trị việc ứng dụng AI trong công việc theo chương trình "Bình dân hóa AI" nửa cuối 2026 (H2). Mỗi cá nhân đăng ký Use Case AI (tối giản), cập nhật nội dung &amp; kế hoạch, tự chấm KPI năng lực/khóa học và khai lan tỏa; teamlead duyệt và chấm điểm US; hệ thống tổng hợp KPI và xếp hạng.</w:t>
+      </w:r>
+    </w:p>
+    <w:p>
+      <w:r>
+        <w:rPr>
+          <w:b/>
+          <w:sz w:val="22"/>
+        </w:rPr>
+        <w:t>Điểm mới của luồng 2026-09:</w:t>
+      </w:r>
+    </w:p>
+    <w:p>
+      <w:pPr>
+        <w:pStyle w:val="ListBullet"/>
+      </w:pPr>
+      <w:r>
+        <w:rPr>
+          <w:sz w:val="21"/>
+        </w:rPr>
+        <w:t>Đăng ký Use Case TỐI GIẢN — chỉ 1 bước: chọn Workflow → Use Case + kế hoạch hành động T9–T12.</w:t>
+      </w:r>
+    </w:p>
+    <w:p>
+      <w:pPr>
+        <w:pStyle w:val="ListBullet"/>
+      </w:pPr>
+      <w:r>
+        <w:rPr>
+          <w:sz w:val="21"/>
+        </w:rPr>
+        <w:t>"Cập nhật US" (thay "Cập nhật tuần") — nơi bổ sung Prompt/Luồng AI, demo, kế hoạch và số liệu cho US đã đăng ký.</w:t>
+      </w:r>
+    </w:p>
+    <w:p>
+      <w:pPr>
+        <w:pStyle w:val="ListBullet"/>
+      </w:pPr>
+      <w:r>
+        <w:rPr>
+          <w:sz w:val="21"/>
+        </w:rPr>
+        <w:t>Thêm "US H1" (tra cứu use case kỳ H1, chỉ đọc) và "Bài tập AI" (chia sẻ thao tác AI nhỏ, không tính KPI).</w:t>
+      </w:r>
+    </w:p>
+    <w:p>
+      <w:pPr>
+        <w:pStyle w:val="ListBullet"/>
+      </w:pPr>
+      <w:r>
+        <w:rPr>
+          <w:sz w:val="21"/>
+        </w:rPr>
+        <w:t>Nhân sự TỰ CHẤM KPI (năng lực + khóa học) và khai Lan tỏa → Teamlead DUYỆT (điểm chỉ tính sau khi duyệt).</w:t>
       </w:r>
     </w:p>
     <w:p>
@@ -90,7 +143,7 @@
         <w:rPr>
           <w:sz w:val="21"/>
         </w:rPr>
-        <w:t>NHÂN SỰ (thành viên): đăng ký Use Case, cập nhật tuần, dùng Thư viện AI &amp; xác nhận tái dùng, xem điểm.</w:t>
+        <w:t>NHÂN SỰ (thành viên): đăng ký US, cập nhật US, tra cứu US H1, chia sẻ Bài tập AI, tự chấm KPI &amp; khai lan tỏa, dùng Thư viện AI, xem điểm.</w:t>
       </w:r>
     </w:p>
     <w:p>
@@ -101,7 +154,7 @@
         <w:rPr>
           <w:sz w:val="21"/>
         </w:rPr>
-        <w:t>TEAMLEAD: chấm điểm US (hội đồng), chấm điểm cá nhân theo tháng, đọc KPI tổng hợp &amp; Heatmap.</w:t>
+        <w:t>TEAMLEAD: duyệt tự chấm điểm &amp; lan tỏa, chấm điểm US (hội đồng), đọc KPI tổng hợp &amp; Heatmap (và chấm cá nhân trực tiếp khi cần).</w:t>
       </w:r>
     </w:p>
     <w:p>
@@ -278,7 +331,7 @@
               <a:graphicData uri="http://schemas.openxmlformats.org/drawingml/2006/picture">
                 <pic:pic>
                   <pic:nvPicPr>
-                    <pic:cNvPr id="0" name="02_home_member.png"/>
+                    <pic:cNvPr id="0" name="02_home.png"/>
                     <pic:cNvPicPr/>
                   </pic:nvPicPr>
                   <pic:blipFill>
@@ -322,7 +375,7 @@
         <w:rPr>
           <w:color w:val="6B21A8"/>
         </w:rPr>
-        <w:t>3.1  Đăng ký Use Case AI</w:t>
+        <w:t>3.1  Đăng ký Use Case AI (tối giản)</w:t>
       </w:r>
     </w:p>
     <w:tbl>
@@ -374,7 +427,7 @@
                 <w:color w:val="6B7280"/>
                 <w:sz w:val="20"/>
               </w:rPr>
-              <w:t>Vào "Đăng ký Use Case". Bước 1 chọn Workflow (lọc theo Team của bạn + Workflow chung), rồi chọn Use Case tương ứng; hoặc chọn "Khác — nhập tự do" nếu chưa có trong danh mục.</w:t>
+              <w:t>Vào "Đăng ký Use Case". Chọn Workflow (lọc theo Team của bạn + Workflow chung), rồi chọn Use Case tương ứng trong danh mục chuẩn; hoặc chọn "Khác — nhập tự do" nếu chưa có.</w:t>
             </w:r>
           </w:p>
         </w:tc>
@@ -422,7 +475,7 @@
                 <w:b/>
                 <w:sz w:val="22"/>
               </w:rPr>
-              <w:t>Điền 4 bước</w:t>
+              <w:t>Điền Kế hoạch hành động T9–T12</w:t>
               <w:br/>
             </w:r>
             <w:r>
@@ -430,7 +483,7 @@
                 <w:color w:val="6B7280"/>
                 <w:sz w:val="20"/>
               </w:rPr>
-              <w:t>Nghiệp vụ → AI &amp; Prompt → Demo (link minh chứng) → Hướng dẫn. Bấm Gửi để nộp use case.</w:t>
+              <w:t>Nhập việc dự kiến từng tháng (T9, T10, T11, T12) — bắt buộc ít nhất 1 tháng. Bấm Gửi để đăng ký.</w:t>
             </w:r>
           </w:p>
         </w:tc>
@@ -453,7 +506,7 @@
               <a:graphicData uri="http://schemas.openxmlformats.org/drawingml/2006/picture">
                 <pic:pic>
                   <pic:nvPicPr>
-                    <pic:cNvPr id="0" name="03_register_workflow.png"/>
+                    <pic:cNvPr id="0" name="03_register.png"/>
                     <pic:cNvPicPr/>
                   </pic:nvPicPr>
                   <pic:blipFill>
@@ -486,9 +539,37 @@
           <w:color w:val="6B7280"/>
           <w:sz w:val="18"/>
         </w:rPr>
-        <w:t>Hình 3 — Bước 1: chọn Workflow và Use Case theo danh mục chuẩn</w:t>
+        <w:t>Hình 3 — Đăng ký Use Case: chọn Workflow/US + kế hoạch T9–T12</w:t>
       </w:r>
     </w:p>
+    <w:tbl>
+      <w:tblPr>
+        <w:tblStyle w:val="TableGrid"/>
+        <w:tblW w:type="auto" w:w="0"/>
+        <w:tblLook w:firstColumn="1" w:firstRow="1" w:lastColumn="0" w:lastRow="0" w:noHBand="0" w:noVBand="1" w:val="04A0"/>
+      </w:tblPr>
+      <w:tblGrid>
+        <w:gridCol w:w="8640"/>
+      </w:tblGrid>
+      <w:tr>
+        <w:tc>
+          <w:tcPr>
+            <w:tcW w:type="dxa" w:w="8640"/>
+            <w:shd w:val="clear" w:color="auto" w:fill="D1FAE5"/>
+          </w:tcPr>
+          <w:p>
+            <w:r>
+              <w:rPr>
+                <w:color w:val="1F2537"/>
+                <w:sz w:val="20"/>
+              </w:rPr>
+              <w:t>Đăng ký nay rất gọn: KHÔNG cần điền điểm đau/quy trình/prompt/demo ngay. Các nội dung đó bổ sung sau ở màn "Cập nhật US" (mục 3.2). US mới mặc định ở Stage "S1 — Ý tưởng".</w:t>
+            </w:r>
+          </w:p>
+        </w:tc>
+      </w:tr>
+    </w:tbl>
+    <w:p/>
     <w:p>
       <w:pPr>
         <w:pStyle w:val="Heading2"/>
@@ -497,7 +578,16 @@
         <w:rPr>
           <w:color w:val="6B21A8"/>
         </w:rPr>
-        <w:t>3.2  Cập nhật tiến độ tuần</w:t>
+        <w:t>3.2  Cập nhật US (nội dung, prompt &amp; kế hoạch)</w:t>
+      </w:r>
+    </w:p>
+    <w:p>
+      <w:r>
+        <w:rPr>
+          <w:b w:val="0"/>
+          <w:sz w:val="22"/>
+        </w:rPr>
+        <w:t>Màn "Cập nhật US" (thay cho "Cập nhật tuần" trước đây) là nơi làm giàu use case đã đăng ký.</w:t>
       </w:r>
     </w:p>
     <w:tbl>
@@ -541,7 +631,7 @@
                 <w:b/>
                 <w:sz w:val="22"/>
               </w:rPr>
-              <w:t>Cập nhật kết quả áp dụng</w:t>
+              <w:t>Chọn US của bạn</w:t>
               <w:br/>
             </w:r>
             <w:r>
@@ -549,7 +639,63 @@
                 <w:color w:val="6B7280"/>
                 <w:sz w:val="20"/>
               </w:rPr>
-              <w:t>Vào "Cập nhật tuần", chọn use case của bạn và điền tiến độ / kết quả ứng dụng trong tuần. Đây là căn cứ đo mức độ áp dụng AI thực tế.</w:t>
+              <w:t>Vào "Cập nhật US", chọn use case cần cập nhật từ danh sách/picker.</w:t>
+            </w:r>
+          </w:p>
+        </w:tc>
+      </w:tr>
+    </w:tbl>
+    <w:p/>
+    <w:tbl>
+      <w:tblPr>
+        <w:tblStyle w:val="TableGrid"/>
+        <w:tblW w:type="auto" w:w="0"/>
+        <w:jc w:val="center"/>
+        <w:tblLook w:firstColumn="1" w:firstRow="1" w:lastColumn="0" w:lastRow="0" w:noHBand="0" w:noVBand="1" w:val="04A0"/>
+      </w:tblPr>
+      <w:tblGrid>
+        <w:gridCol w:w="4320"/>
+        <w:gridCol w:w="4320"/>
+      </w:tblGrid>
+      <w:tr>
+        <w:tc>
+          <w:tcPr>
+            <w:tcW w:type="dxa" w:w="737"/>
+            <w:shd w:val="clear" w:color="auto" w:fill="6B21A8"/>
+          </w:tcPr>
+          <w:p>
+            <w:pPr>
+              <w:jc w:val="center"/>
+            </w:pPr>
+            <w:r>
+              <w:rPr>
+                <w:b/>
+                <w:color w:val="FFFFFF"/>
+                <w:sz w:val="30"/>
+              </w:rPr>
+              <w:t>2</w:t>
+            </w:r>
+          </w:p>
+        </w:tc>
+        <w:tc>
+          <w:tcPr>
+            <w:tcW w:type="dxa" w:w="4320"/>
+          </w:tcPr>
+          <w:p>
+            <w:r>
+              <w:rPr>
+                <w:b/>
+                <w:sz w:val="22"/>
+              </w:rPr>
+              <w:t>Bổ sung nội dung</w:t>
+              <w:br/>
+            </w:r>
+            <w:r>
+              <w:rPr>
+                <w:color w:val="6B7280"/>
+                <w:sz w:val="20"/>
+              </w:rPr>
+              <w:t>Điền/sửa Prompt &amp; Luồng xử lý AI (mở sẵn — nội dung chính), link Demo, Kế hoạch hành động 4 tháng và số liệu tiến độ. Ghi chú không bắt buộc. Bấm lưu để cập nhật.</w:t>
             </w:r>
           </w:p>
         </w:tc>
@@ -572,7 +718,7 @@
               <a:graphicData uri="http://schemas.openxmlformats.org/drawingml/2006/picture">
                 <pic:pic>
                   <pic:nvPicPr>
-                    <pic:cNvPr id="0" name="04_weekly_update.png"/>
+                    <pic:cNvPr id="0" name="04_update_us.png"/>
                     <pic:cNvPicPr/>
                   </pic:nvPicPr>
                   <pic:blipFill>
@@ -605,7 +751,271 @@
           <w:color w:val="6B7280"/>
           <w:sz w:val="18"/>
         </w:rPr>
-        <w:t>Hình 4 — Cập nhật tiến độ tuần</w:t>
+        <w:t>Hình 4 — Cập nhật US: prompt/luồng AI + demo + kế hoạch + số liệu</w:t>
+      </w:r>
+    </w:p>
+    <w:tbl>
+      <w:tblPr>
+        <w:tblStyle w:val="TableGrid"/>
+        <w:tblW w:type="auto" w:w="0"/>
+        <w:tblLook w:firstColumn="1" w:firstRow="1" w:lastColumn="0" w:lastRow="0" w:noHBand="0" w:noVBand="1" w:val="04A0"/>
+      </w:tblPr>
+      <w:tblGrid>
+        <w:gridCol w:w="8640"/>
+      </w:tblGrid>
+      <w:tr>
+        <w:tc>
+          <w:tcPr>
+            <w:tcW w:type="dxa" w:w="8640"/>
+            <w:shd w:val="clear" w:color="auto" w:fill="EDE9FE"/>
+          </w:tcPr>
+          <w:p>
+            <w:r>
+              <w:rPr>
+                <w:color w:val="1F2537"/>
+                <w:sz w:val="20"/>
+              </w:rPr>
+              <w:t>Mỗi lần cập nhật được ghi vào "Lịch sử cập nhật" của use case để theo dõi tiến trình.</w:t>
+            </w:r>
+          </w:p>
+        </w:tc>
+      </w:tr>
+    </w:tbl>
+    <w:p/>
+    <w:p>
+      <w:pPr>
+        <w:pStyle w:val="Heading2"/>
+      </w:pPr>
+      <w:r>
+        <w:rPr>
+          <w:color w:val="6B21A8"/>
+        </w:rPr>
+        <w:t>3.3  Tra cứu US H1 (chỉ đọc)</w:t>
+      </w:r>
+    </w:p>
+    <w:p>
+      <w:r>
+        <w:rPr>
+          <w:b w:val="0"/>
+          <w:sz w:val="22"/>
+        </w:rPr>
+        <w:t>Menu "US H1" là kho tra cứu các use case kỳ H1 (nửa đầu năm) để tham khảo — tách khỏi US H2 và KPI hiện hành.</w:t>
+      </w:r>
+    </w:p>
+    <w:tbl>
+      <w:tblPr>
+        <w:tblStyle w:val="TableGrid"/>
+        <w:tblW w:type="auto" w:w="0"/>
+        <w:jc w:val="center"/>
+        <w:tblLook w:firstColumn="1" w:firstRow="1" w:lastColumn="0" w:lastRow="0" w:noHBand="0" w:noVBand="1" w:val="04A0"/>
+      </w:tblPr>
+      <w:tblGrid>
+        <w:gridCol w:w="4320"/>
+        <w:gridCol w:w="4320"/>
+      </w:tblGrid>
+      <w:tr>
+        <w:tc>
+          <w:tcPr>
+            <w:tcW w:type="dxa" w:w="737"/>
+            <w:shd w:val="clear" w:color="auto" w:fill="6B21A8"/>
+          </w:tcPr>
+          <w:p>
+            <w:pPr>
+              <w:jc w:val="center"/>
+            </w:pPr>
+            <w:r>
+              <w:rPr>
+                <w:b/>
+                <w:color w:val="FFFFFF"/>
+                <w:sz w:val="30"/>
+              </w:rPr>
+              <w:t>1</w:t>
+            </w:r>
+          </w:p>
+        </w:tc>
+        <w:tc>
+          <w:tcPr>
+            <w:tcW w:type="dxa" w:w="4320"/>
+          </w:tcPr>
+          <w:p>
+            <w:r>
+              <w:rPr>
+                <w:b/>
+                <w:sz w:val="22"/>
+              </w:rPr>
+              <w:t>Tìm &amp; lọc</w:t>
+              <w:br/>
+            </w:r>
+            <w:r>
+              <w:rPr>
+                <w:color w:val="6B7280"/>
+                <w:sz w:val="20"/>
+              </w:rPr>
+              <w:t>Dùng ô tìm kiếm (mã/tên/owner/mô tả) và bộ lọc Team / Workflow / Stage để thu hẹp danh sách.</w:t>
+            </w:r>
+          </w:p>
+        </w:tc>
+      </w:tr>
+    </w:tbl>
+    <w:p/>
+    <w:tbl>
+      <w:tblPr>
+        <w:tblStyle w:val="TableGrid"/>
+        <w:tblW w:type="auto" w:w="0"/>
+        <w:jc w:val="center"/>
+        <w:tblLook w:firstColumn="1" w:firstRow="1" w:lastColumn="0" w:lastRow="0" w:noHBand="0" w:noVBand="1" w:val="04A0"/>
+      </w:tblPr>
+      <w:tblGrid>
+        <w:gridCol w:w="4320"/>
+        <w:gridCol w:w="4320"/>
+      </w:tblGrid>
+      <w:tr>
+        <w:tc>
+          <w:tcPr>
+            <w:tcW w:type="dxa" w:w="737"/>
+            <w:shd w:val="clear" w:color="auto" w:fill="6B21A8"/>
+          </w:tcPr>
+          <w:p>
+            <w:pPr>
+              <w:jc w:val="center"/>
+            </w:pPr>
+            <w:r>
+              <w:rPr>
+                <w:b/>
+                <w:color w:val="FFFFFF"/>
+                <w:sz w:val="30"/>
+              </w:rPr>
+              <w:t>2</w:t>
+            </w:r>
+          </w:p>
+        </w:tc>
+        <w:tc>
+          <w:tcPr>
+            <w:tcW w:type="dxa" w:w="4320"/>
+          </w:tcPr>
+          <w:p>
+            <w:r>
+              <w:rPr>
+                <w:b/>
+                <w:sz w:val="22"/>
+              </w:rPr>
+              <w:t>Xem chi tiết</w:t>
+              <w:br/>
+            </w:r>
+            <w:r>
+              <w:rPr>
+                <w:color w:val="6B7280"/>
+                <w:sz w:val="20"/>
+              </w:rPr>
+              <w:t>Bấm vào một dòng để mở cửa sổ chi tiết: điểm đau, luồng AI, prompt đầy đủ, kế hoạch và link demo.</w:t>
+            </w:r>
+          </w:p>
+        </w:tc>
+      </w:tr>
+    </w:tbl>
+    <w:p/>
+    <w:p>
+      <w:pPr>
+        <w:jc w:val="center"/>
+      </w:pPr>
+      <w:r>
+        <w:drawing>
+          <wp:inline xmlns:a="http://schemas.openxmlformats.org/drawingml/2006/main" xmlns:pic="http://schemas.openxmlformats.org/drawingml/2006/picture">
+            <wp:extent cx="5580000" cy="3587143"/>
+            <wp:docPr id="5" name="Picture 5"/>
+            <wp:cNvGraphicFramePr>
+              <a:graphicFrameLocks noChangeAspect="1"/>
+            </wp:cNvGraphicFramePr>
+            <a:graphic>
+              <a:graphicData uri="http://schemas.openxmlformats.org/drawingml/2006/picture">
+                <pic:pic>
+                  <pic:nvPicPr>
+                    <pic:cNvPr id="0" name="05_us_h1.png"/>
+                    <pic:cNvPicPr/>
+                  </pic:nvPicPr>
+                  <pic:blipFill>
+                    <a:blip r:embed="rId13"/>
+                    <a:stretch>
+                      <a:fillRect/>
+                    </a:stretch>
+                  </pic:blipFill>
+                  <pic:spPr>
+                    <a:xfrm>
+                      <a:off x="0" y="0"/>
+                      <a:ext cx="5580000" cy="3587143"/>
+                    </a:xfrm>
+                    <a:prstGeom prst="rect"/>
+                  </pic:spPr>
+                </pic:pic>
+              </a:graphicData>
+            </a:graphic>
+          </wp:inline>
+        </w:drawing>
+      </w:r>
+    </w:p>
+    <w:p>
+      <w:pPr>
+        <w:jc w:val="center"/>
+      </w:pPr>
+      <w:r>
+        <w:rPr>
+          <w:i/>
+          <w:color w:val="6B7280"/>
+          <w:sz w:val="18"/>
+        </w:rPr>
+        <w:t>Hình 5 — US H1: bảng tra cứu + tìm kiếm + bộ lọc</w:t>
+      </w:r>
+    </w:p>
+    <w:p>
+      <w:pPr>
+        <w:jc w:val="center"/>
+      </w:pPr>
+      <w:r>
+        <w:drawing>
+          <wp:inline xmlns:a="http://schemas.openxmlformats.org/drawingml/2006/main" xmlns:pic="http://schemas.openxmlformats.org/drawingml/2006/picture">
+            <wp:extent cx="5580000" cy="3587143"/>
+            <wp:docPr id="6" name="Picture 6"/>
+            <wp:cNvGraphicFramePr>
+              <a:graphicFrameLocks noChangeAspect="1"/>
+            </wp:cNvGraphicFramePr>
+            <a:graphic>
+              <a:graphicData uri="http://schemas.openxmlformats.org/drawingml/2006/picture">
+                <pic:pic>
+                  <pic:nvPicPr>
+                    <pic:cNvPr id="0" name="06_us_h1_detail.png"/>
+                    <pic:cNvPicPr/>
+                  </pic:nvPicPr>
+                  <pic:blipFill>
+                    <a:blip r:embed="rId14"/>
+                    <a:stretch>
+                      <a:fillRect/>
+                    </a:stretch>
+                  </pic:blipFill>
+                  <pic:spPr>
+                    <a:xfrm>
+                      <a:off x="0" y="0"/>
+                      <a:ext cx="5580000" cy="3587143"/>
+                    </a:xfrm>
+                    <a:prstGeom prst="rect"/>
+                  </pic:spPr>
+                </pic:pic>
+              </a:graphicData>
+            </a:graphic>
+          </wp:inline>
+        </w:drawing>
+      </w:r>
+    </w:p>
+    <w:p>
+      <w:pPr>
+        <w:jc w:val="center"/>
+      </w:pPr>
+      <w:r>
+        <w:rPr>
+          <w:i/>
+          <w:color w:val="6B7280"/>
+          <w:sz w:val="18"/>
+        </w:rPr>
+        <w:t>Hình 6 — US H1: cửa sổ xem chi tiết (chỉ đọc)</w:t>
       </w:r>
     </w:p>
     <w:p>
@@ -616,7 +1026,7 @@
         <w:rPr>
           <w:color w:val="6B21A8"/>
         </w:rPr>
-        <w:t>3.3  Thư viện AI &amp; xác nhận tái dùng</w:t>
+        <w:t>3.4  Bài tập AI (chia sẻ thao tác nhỏ)</w:t>
       </w:r>
     </w:p>
     <w:p>
@@ -625,7 +1035,487 @@
           <w:b w:val="0"/>
           <w:sz w:val="22"/>
         </w:rPr>
-        <w:t>Thư viện gom các use case đã duyệt kèm prompt/workflow để mọi người tham khảo và tái dùng.</w:t>
+        <w:t>"Bài tập AI" để chia sẻ nhanh các thao tác AI nhỏ (chưa đủ thành một Use Case). KHÔNG tính vào điểm/KPI.</w:t>
+      </w:r>
+    </w:p>
+    <w:tbl>
+      <w:tblPr>
+        <w:tblStyle w:val="TableGrid"/>
+        <w:tblW w:type="auto" w:w="0"/>
+        <w:jc w:val="center"/>
+        <w:tblLook w:firstColumn="1" w:firstRow="1" w:lastColumn="0" w:lastRow="0" w:noHBand="0" w:noVBand="1" w:val="04A0"/>
+      </w:tblPr>
+      <w:tblGrid>
+        <w:gridCol w:w="4320"/>
+        <w:gridCol w:w="4320"/>
+      </w:tblGrid>
+      <w:tr>
+        <w:tc>
+          <w:tcPr>
+            <w:tcW w:type="dxa" w:w="737"/>
+            <w:shd w:val="clear" w:color="auto" w:fill="6B21A8"/>
+          </w:tcPr>
+          <w:p>
+            <w:pPr>
+              <w:jc w:val="center"/>
+            </w:pPr>
+            <w:r>
+              <w:rPr>
+                <w:b/>
+                <w:color w:val="FFFFFF"/>
+                <w:sz w:val="30"/>
+              </w:rPr>
+              <w:t>1</w:t>
+            </w:r>
+          </w:p>
+        </w:tc>
+        <w:tc>
+          <w:tcPr>
+            <w:tcW w:type="dxa" w:w="4320"/>
+          </w:tcPr>
+          <w:p>
+            <w:r>
+              <w:rPr>
+                <w:b/>
+                <w:sz w:val="22"/>
+              </w:rPr>
+              <w:t>Đăng bài</w:t>
+              <w:br/>
+            </w:r>
+            <w:r>
+              <w:rPr>
+                <w:color w:val="6B7280"/>
+                <w:sz w:val="20"/>
+              </w:rPr>
+              <w:t>Điền Tiêu đề + Mô tả ngắn + Prompt (bắt buộc) + link demo ổ chung (tùy chọn). Bấm "Đăng bài".</w:t>
+            </w:r>
+          </w:p>
+        </w:tc>
+      </w:tr>
+    </w:tbl>
+    <w:p/>
+    <w:tbl>
+      <w:tblPr>
+        <w:tblStyle w:val="TableGrid"/>
+        <w:tblW w:type="auto" w:w="0"/>
+        <w:jc w:val="center"/>
+        <w:tblLook w:firstColumn="1" w:firstRow="1" w:lastColumn="0" w:lastRow="0" w:noHBand="0" w:noVBand="1" w:val="04A0"/>
+      </w:tblPr>
+      <w:tblGrid>
+        <w:gridCol w:w="4320"/>
+        <w:gridCol w:w="4320"/>
+      </w:tblGrid>
+      <w:tr>
+        <w:tc>
+          <w:tcPr>
+            <w:tcW w:type="dxa" w:w="737"/>
+            <w:shd w:val="clear" w:color="auto" w:fill="6B21A8"/>
+          </w:tcPr>
+          <w:p>
+            <w:pPr>
+              <w:jc w:val="center"/>
+            </w:pPr>
+            <w:r>
+              <w:rPr>
+                <w:b/>
+                <w:color w:val="FFFFFF"/>
+                <w:sz w:val="30"/>
+              </w:rPr>
+              <w:t>2</w:t>
+            </w:r>
+          </w:p>
+        </w:tc>
+        <w:tc>
+          <w:tcPr>
+            <w:tcW w:type="dxa" w:w="4320"/>
+          </w:tcPr>
+          <w:p>
+            <w:r>
+              <w:rPr>
+                <w:b/>
+                <w:sz w:val="22"/>
+              </w:rPr>
+              <w:t>Tra cứu &amp; tái dùng</w:t>
+              <w:br/>
+            </w:r>
+            <w:r>
+              <w:rPr>
+                <w:color w:val="6B7280"/>
+                <w:sz w:val="20"/>
+              </w:rPr>
+              <w:t>Tìm kiếm bài của đồng nghiệp, mở "Xem Prompt" và bấm "Copy Prompt" để dùng lại; sửa/xóa bài của chính mình.</w:t>
+            </w:r>
+          </w:p>
+        </w:tc>
+      </w:tr>
+    </w:tbl>
+    <w:p/>
+    <w:p>
+      <w:pPr>
+        <w:jc w:val="center"/>
+      </w:pPr>
+      <w:r>
+        <w:drawing>
+          <wp:inline xmlns:a="http://schemas.openxmlformats.org/drawingml/2006/main" xmlns:pic="http://schemas.openxmlformats.org/drawingml/2006/picture">
+            <wp:extent cx="5580000" cy="3587143"/>
+            <wp:docPr id="7" name="Picture 7"/>
+            <wp:cNvGraphicFramePr>
+              <a:graphicFrameLocks noChangeAspect="1"/>
+            </wp:cNvGraphicFramePr>
+            <a:graphic>
+              <a:graphicData uri="http://schemas.openxmlformats.org/drawingml/2006/picture">
+                <pic:pic>
+                  <pic:nvPicPr>
+                    <pic:cNvPr id="0" name="07_ai_exercise.png"/>
+                    <pic:cNvPicPr/>
+                  </pic:nvPicPr>
+                  <pic:blipFill>
+                    <a:blip r:embed="rId15"/>
+                    <a:stretch>
+                      <a:fillRect/>
+                    </a:stretch>
+                  </pic:blipFill>
+                  <pic:spPr>
+                    <a:xfrm>
+                      <a:off x="0" y="0"/>
+                      <a:ext cx="5580000" cy="3587143"/>
+                    </a:xfrm>
+                    <a:prstGeom prst="rect"/>
+                  </pic:spPr>
+                </pic:pic>
+              </a:graphicData>
+            </a:graphic>
+          </wp:inline>
+        </w:drawing>
+      </w:r>
+    </w:p>
+    <w:p>
+      <w:pPr>
+        <w:jc w:val="center"/>
+      </w:pPr>
+      <w:r>
+        <w:rPr>
+          <w:i/>
+          <w:color w:val="6B7280"/>
+          <w:sz w:val="18"/>
+        </w:rPr>
+        <w:t>Hình 7 — Bài tập AI: đăng bài + tra cứu + copy prompt</w:t>
+      </w:r>
+    </w:p>
+    <w:tbl>
+      <w:tblPr>
+        <w:tblStyle w:val="TableGrid"/>
+        <w:tblW w:type="auto" w:w="0"/>
+        <w:tblLook w:firstColumn="1" w:firstRow="1" w:lastColumn="0" w:lastRow="0" w:noHBand="0" w:noVBand="1" w:val="04A0"/>
+      </w:tblPr>
+      <w:tblGrid>
+        <w:gridCol w:w="8640"/>
+      </w:tblGrid>
+      <w:tr>
+        <w:tc>
+          <w:tcPr>
+            <w:tcW w:type="dxa" w:w="8640"/>
+            <w:shd w:val="clear" w:color="auto" w:fill="D1FAE5"/>
+          </w:tcPr>
+          <w:p>
+            <w:r>
+              <w:rPr>
+                <w:color w:val="1F2537"/>
+                <w:sz w:val="20"/>
+              </w:rPr>
+              <w:t>Nhịp gợi ý 1 bài/tuần chỉ là khuyến khích (hệ thống nhắc nhẹ), không bắt buộc. Xóa bài sẽ hỏi xác nhận.</w:t>
+            </w:r>
+          </w:p>
+        </w:tc>
+      </w:tr>
+    </w:tbl>
+    <w:p/>
+    <w:p>
+      <w:pPr>
+        <w:pStyle w:val="Heading2"/>
+      </w:pPr>
+      <w:r>
+        <w:rPr>
+          <w:color w:val="6B21A8"/>
+        </w:rPr>
+        <w:t>3.5  Tự chấm KPI &amp; khai Lan tỏa</w:t>
+      </w:r>
+    </w:p>
+    <w:p>
+      <w:r>
+        <w:rPr>
+          <w:b w:val="0"/>
+          <w:sz w:val="22"/>
+        </w:rPr>
+        <w:t>Nhân sự TỰ CHẤM hai cấu phần KPI theo THÁNG và khai hoạt động Lan tỏa; teamlead sẽ duyệt (mục 4.1). Điểm chỉ được tính vào KPI SAU khi teamlead duyệt.</w:t>
+      </w:r>
+    </w:p>
+    <w:tbl>
+      <w:tblPr>
+        <w:tblStyle w:val="TableGrid"/>
+        <w:tblW w:type="auto" w:w="0"/>
+        <w:jc w:val="center"/>
+        <w:tblLook w:firstColumn="1" w:firstRow="1" w:lastColumn="0" w:lastRow="0" w:noHBand="0" w:noVBand="1" w:val="04A0"/>
+      </w:tblPr>
+      <w:tblGrid>
+        <w:gridCol w:w="4320"/>
+        <w:gridCol w:w="4320"/>
+      </w:tblGrid>
+      <w:tr>
+        <w:tc>
+          <w:tcPr>
+            <w:tcW w:type="dxa" w:w="737"/>
+            <w:shd w:val="clear" w:color="auto" w:fill="6B21A8"/>
+          </w:tcPr>
+          <w:p>
+            <w:pPr>
+              <w:jc w:val="center"/>
+            </w:pPr>
+            <w:r>
+              <w:rPr>
+                <w:b/>
+                <w:color w:val="FFFFFF"/>
+                <w:sz w:val="30"/>
+              </w:rPr>
+              <w:t>1</w:t>
+            </w:r>
+          </w:p>
+        </w:tc>
+        <w:tc>
+          <w:tcPr>
+            <w:tcW w:type="dxa" w:w="4320"/>
+          </w:tcPr>
+          <w:p>
+            <w:r>
+              <w:rPr>
+                <w:b/>
+                <w:sz w:val="22"/>
+              </w:rPr>
+              <w:t>Chấm KPI2 — Năng lực ứng dụng AI</w:t>
+              <w:br/>
+            </w:r>
+            <w:r>
+              <w:rPr>
+                <w:color w:val="6B7280"/>
+                <w:sz w:val="20"/>
+              </w:rPr>
+              <w:t>Tự cho điểm 0–10 cho 4 tiêu chí: Đa dạng ứng dụng · Thành thạo AI · Chất lượng kết quả · Số lượng/tần suất. Hệ thống hiển thị điểm KPI2 dự kiến.</w:t>
+            </w:r>
+          </w:p>
+        </w:tc>
+      </w:tr>
+    </w:tbl>
+    <w:p/>
+    <w:tbl>
+      <w:tblPr>
+        <w:tblStyle w:val="TableGrid"/>
+        <w:tblW w:type="auto" w:w="0"/>
+        <w:jc w:val="center"/>
+        <w:tblLook w:firstColumn="1" w:firstRow="1" w:lastColumn="0" w:lastRow="0" w:noHBand="0" w:noVBand="1" w:val="04A0"/>
+      </w:tblPr>
+      <w:tblGrid>
+        <w:gridCol w:w="4320"/>
+        <w:gridCol w:w="4320"/>
+      </w:tblGrid>
+      <w:tr>
+        <w:tc>
+          <w:tcPr>
+            <w:tcW w:type="dxa" w:w="737"/>
+            <w:shd w:val="clear" w:color="auto" w:fill="6B21A8"/>
+          </w:tcPr>
+          <w:p>
+            <w:pPr>
+              <w:jc w:val="center"/>
+            </w:pPr>
+            <w:r>
+              <w:rPr>
+                <w:b/>
+                <w:color w:val="FFFFFF"/>
+                <w:sz w:val="30"/>
+              </w:rPr>
+              <w:t>2</w:t>
+            </w:r>
+          </w:p>
+        </w:tc>
+        <w:tc>
+          <w:tcPr>
+            <w:tcW w:type="dxa" w:w="4320"/>
+          </w:tcPr>
+          <w:p>
+            <w:r>
+              <w:rPr>
+                <w:b/>
+                <w:sz w:val="22"/>
+              </w:rPr>
+              <w:t>Khai KPI3 — Khóa học</w:t>
+              <w:br/>
+            </w:r>
+            <w:r>
+              <w:rPr>
+                <w:color w:val="6B7280"/>
+                <w:sz w:val="20"/>
+              </w:rPr>
+              <w:t>Nhập số khóa đã hoàn thành và số khóa trả phí; đính link bằng chứng (chứng chỉ).</w:t>
+            </w:r>
+          </w:p>
+        </w:tc>
+      </w:tr>
+    </w:tbl>
+    <w:p/>
+    <w:tbl>
+      <w:tblPr>
+        <w:tblStyle w:val="TableGrid"/>
+        <w:tblW w:type="auto" w:w="0"/>
+        <w:jc w:val="center"/>
+        <w:tblLook w:firstColumn="1" w:firstRow="1" w:lastColumn="0" w:lastRow="0" w:noHBand="0" w:noVBand="1" w:val="04A0"/>
+      </w:tblPr>
+      <w:tblGrid>
+        <w:gridCol w:w="4320"/>
+        <w:gridCol w:w="4320"/>
+      </w:tblGrid>
+      <w:tr>
+        <w:tc>
+          <w:tcPr>
+            <w:tcW w:type="dxa" w:w="737"/>
+            <w:shd w:val="clear" w:color="auto" w:fill="6B21A8"/>
+          </w:tcPr>
+          <w:p>
+            <w:pPr>
+              <w:jc w:val="center"/>
+            </w:pPr>
+            <w:r>
+              <w:rPr>
+                <w:b/>
+                <w:color w:val="FFFFFF"/>
+                <w:sz w:val="30"/>
+              </w:rPr>
+              <w:t>3</w:t>
+            </w:r>
+          </w:p>
+        </w:tc>
+        <w:tc>
+          <w:tcPr>
+            <w:tcW w:type="dxa" w:w="4320"/>
+          </w:tcPr>
+          <w:p>
+            <w:r>
+              <w:rPr>
+                <w:b/>
+                <w:sz w:val="22"/>
+              </w:rPr>
+              <w:t>Nộp cho teamlead</w:t>
+              <w:br/>
+            </w:r>
+            <w:r>
+              <w:rPr>
+                <w:color w:val="6B7280"/>
+                <w:sz w:val="20"/>
+              </w:rPr>
+              <w:t>Có thể "Lưu nháp" để hoàn thiện sau, hoặc "Nộp cho teamlead" để đưa vào hàng chờ duyệt.</w:t>
+            </w:r>
+          </w:p>
+        </w:tc>
+      </w:tr>
+    </w:tbl>
+    <w:p/>
+    <w:p>
+      <w:pPr>
+        <w:jc w:val="center"/>
+      </w:pPr>
+      <w:r>
+        <w:drawing>
+          <wp:inline xmlns:a="http://schemas.openxmlformats.org/drawingml/2006/main" xmlns:pic="http://schemas.openxmlformats.org/drawingml/2006/picture">
+            <wp:extent cx="5580000" cy="3587143"/>
+            <wp:docPr id="8" name="Picture 8"/>
+            <wp:cNvGraphicFramePr>
+              <a:graphicFrameLocks noChangeAspect="1"/>
+            </wp:cNvGraphicFramePr>
+            <a:graphic>
+              <a:graphicData uri="http://schemas.openxmlformats.org/drawingml/2006/picture">
+                <pic:pic>
+                  <pic:nvPicPr>
+                    <pic:cNvPr id="0" name="08_self_score.png"/>
+                    <pic:cNvPicPr/>
+                  </pic:nvPicPr>
+                  <pic:blipFill>
+                    <a:blip r:embed="rId16"/>
+                    <a:stretch>
+                      <a:fillRect/>
+                    </a:stretch>
+                  </pic:blipFill>
+                  <pic:spPr>
+                    <a:xfrm>
+                      <a:off x="0" y="0"/>
+                      <a:ext cx="5580000" cy="3587143"/>
+                    </a:xfrm>
+                    <a:prstGeom prst="rect"/>
+                  </pic:spPr>
+                </pic:pic>
+              </a:graphicData>
+            </a:graphic>
+          </wp:inline>
+        </w:drawing>
+      </w:r>
+    </w:p>
+    <w:p>
+      <w:pPr>
+        <w:jc w:val="center"/>
+      </w:pPr>
+      <w:r>
+        <w:rPr>
+          <w:i/>
+          <w:color w:val="6B7280"/>
+          <w:sz w:val="18"/>
+        </w:rPr>
+        <w:t>Hình 8 — Tự chấm KPI của tôi (KPI2 năng lực + KPI3 khóa học + bằng chứng)</w:t>
+      </w:r>
+    </w:p>
+    <w:tbl>
+      <w:tblPr>
+        <w:tblStyle w:val="TableGrid"/>
+        <w:tblW w:type="auto" w:w="0"/>
+        <w:tblLook w:firstColumn="1" w:firstRow="1" w:lastColumn="0" w:lastRow="0" w:noHBand="0" w:noVBand="1" w:val="04A0"/>
+      </w:tblPr>
+      <w:tblGrid>
+        <w:gridCol w:w="8640"/>
+      </w:tblGrid>
+      <w:tr>
+        <w:tc>
+          <w:tcPr>
+            <w:tcW w:type="dxa" w:w="8640"/>
+            <w:shd w:val="clear" w:color="auto" w:fill="FEF3C7"/>
+          </w:tcPr>
+          <w:p>
+            <w:r>
+              <w:rPr>
+                <w:color w:val="1F2537"/>
+                <w:sz w:val="20"/>
+              </w:rPr>
+              <w:t>Mỗi kỳ (tháng dương lịch) nộp 1 lần; sửa được trước khi duyệt, KHÓA sau khi được Duyệt. Nếu bị Từ chối, màn hình hiện lý do để bạn sửa và nộp lại. Lan tỏa (KPI4) khai kèm mô tả + link bằng chứng.</w:t>
+            </w:r>
+          </w:p>
+        </w:tc>
+      </w:tr>
+    </w:tbl>
+    <w:p/>
+    <w:p>
+      <w:pPr>
+        <w:pStyle w:val="Heading2"/>
+      </w:pPr>
+      <w:r>
+        <w:rPr>
+          <w:color w:val="6B21A8"/>
+        </w:rPr>
+        <w:t>3.6  Thư viện AI &amp; xác nhận tái dùng</w:t>
+      </w:r>
+    </w:p>
+    <w:p>
+      <w:r>
+        <w:rPr>
+          <w:b w:val="0"/>
+          <w:sz w:val="22"/>
+        </w:rPr>
+        <w:t>Thư viện gom các use case kèm prompt/workflow để mọi người tham khảo và tái dùng.</w:t>
       </w:r>
     </w:p>
     <w:tbl>
@@ -733,7 +1623,7 @@
                 <w:color w:val="6B7280"/>
                 <w:sz w:val="20"/>
               </w:rPr>
-              <w:t>Nếu bạn áp dụng lại một use case của người khác, bấm "Tôi đã tái dùng". Khi ≥ 3 người xác nhận, chủ use case được ghi nhận điểm "lan tỏa" (M-KPI-4).</w:t>
+              <w:t>Nếu bạn áp dụng lại use case của người khác, bấm "Tôi đã tái dùng". Khi ≥ 3 người xác nhận, chủ use case được ghi nhận điểm "lan tỏa" (KPI4) tự động — song song với đường khai lan tỏa ở mục 3.5.</w:t>
             </w:r>
           </w:p>
         </w:tc>
@@ -748,7 +1638,7 @@
         <w:drawing>
           <wp:inline xmlns:a="http://schemas.openxmlformats.org/drawingml/2006/main" xmlns:pic="http://schemas.openxmlformats.org/drawingml/2006/picture">
             <wp:extent cx="5580000" cy="3587143"/>
-            <wp:docPr id="5" name="Picture 5"/>
+            <wp:docPr id="9" name="Picture 9"/>
             <wp:cNvGraphicFramePr>
               <a:graphicFrameLocks noChangeAspect="1"/>
             </wp:cNvGraphicFramePr>
@@ -756,11 +1646,11 @@
               <a:graphicData uri="http://schemas.openxmlformats.org/drawingml/2006/picture">
                 <pic:pic>
                   <pic:nvPicPr>
-                    <pic:cNvPr id="0" name="05_library_reuse.png"/>
+                    <pic:cNvPr id="0" name="09_library.png"/>
                     <pic:cNvPicPr/>
                   </pic:nvPicPr>
                   <pic:blipFill>
-                    <a:blip r:embed="rId13"/>
+                    <a:blip r:embed="rId17"/>
                     <a:stretch>
                       <a:fillRect/>
                     </a:stretch>
@@ -789,7 +1679,7 @@
           <w:color w:val="6B7280"/>
           <w:sz w:val="18"/>
         </w:rPr>
-        <w:t>Hình 5 — Thư viện AI và xác nhận tái dùng</w:t>
+        <w:t>Hình 9 — Thư viện AI và xác nhận tái dùng</w:t>
       </w:r>
     </w:p>
     <w:tbl>
@@ -828,7 +1718,7 @@
         <w:rPr>
           <w:color w:val="6B21A8"/>
         </w:rPr>
-        <w:t>3.4  Xem điểm &amp; Leaderboard</w:t>
+        <w:t>3.7  Xem điểm &amp; Leaderboard</w:t>
       </w:r>
     </w:p>
     <w:p>
@@ -837,7 +1727,7 @@
           <w:b w:val="0"/>
           <w:sz w:val="22"/>
         </w:rPr>
-        <w:t>Vào "Leaderboard" để xem xếp hạng điểm US (hội đồng), điểm cá nhân và KPI tổng hợp. Điểm cá nhân của bạn do teamlead chấm theo từng tháng (xem Phần 4).</w:t>
+        <w:t>Vào "Leaderboard" để xem xếp hạng điểm US (hội đồng), điểm cá nhân và KPI tổng hợp. Điểm KPI2/KPI3 của bạn phản ánh sau khi teamlead duyệt bản tự chấm.</w:t>
       </w:r>
     </w:p>
     <w:p>
@@ -848,7 +1738,7 @@
         <w:drawing>
           <wp:inline xmlns:a="http://schemas.openxmlformats.org/drawingml/2006/main" xmlns:pic="http://schemas.openxmlformats.org/drawingml/2006/picture">
             <wp:extent cx="5580000" cy="3587143"/>
-            <wp:docPr id="6" name="Picture 6"/>
+            <wp:docPr id="10" name="Picture 10"/>
             <wp:cNvGraphicFramePr>
               <a:graphicFrameLocks noChangeAspect="1"/>
             </wp:cNvGraphicFramePr>
@@ -856,11 +1746,11 @@
               <a:graphicData uri="http://schemas.openxmlformats.org/drawingml/2006/picture">
                 <pic:pic>
                   <pic:nvPicPr>
-                    <pic:cNvPr id="0" name="10_leaderboard_kpi.png"/>
+                    <pic:cNvPr id="0" name="13_leaderboard_kpi.png"/>
                     <pic:cNvPicPr/>
                   </pic:nvPicPr>
                   <pic:blipFill>
-                    <a:blip r:embed="rId14"/>
+                    <a:blip r:embed="rId18"/>
                     <a:stretch>
                       <a:fillRect/>
                     </a:stretch>
@@ -889,7 +1779,7 @@
           <w:color w:val="6B7280"/>
           <w:sz w:val="18"/>
         </w:rPr>
-        <w:t>Hình 6 — Leaderboard: tab KPI tổng hợp</w:t>
+        <w:t>Hình 10 — Leaderboard: tab KPI tổng hợp</w:t>
       </w:r>
     </w:p>
     <w:p>
@@ -900,7 +1790,7 @@
         <w:rPr>
           <w:color w:val="6B21A8"/>
         </w:rPr>
-        <w:t>3.5  Đổi mật khẩu</w:t>
+        <w:t>3.8  Đổi mật khẩu</w:t>
       </w:r>
     </w:p>
     <w:p>
@@ -911,7 +1801,7 @@
         <w:drawing>
           <wp:inline xmlns:a="http://schemas.openxmlformats.org/drawingml/2006/main" xmlns:pic="http://schemas.openxmlformats.org/drawingml/2006/picture">
             <wp:extent cx="5580000" cy="3587143"/>
-            <wp:docPr id="7" name="Picture 7"/>
+            <wp:docPr id="11" name="Picture 11"/>
             <wp:cNvGraphicFramePr>
               <a:graphicFrameLocks noChangeAspect="1"/>
             </wp:cNvGraphicFramePr>
@@ -919,11 +1809,11 @@
               <a:graphicData uri="http://schemas.openxmlformats.org/drawingml/2006/picture">
                 <pic:pic>
                   <pic:nvPicPr>
-                    <pic:cNvPr id="0" name="12_change_password.png"/>
+                    <pic:cNvPr id="0" name="15_change_password.png"/>
                     <pic:cNvPicPr/>
                   </pic:nvPicPr>
                   <pic:blipFill>
-                    <a:blip r:embed="rId15"/>
+                    <a:blip r:embed="rId19"/>
                     <a:stretch>
                       <a:fillRect/>
                     </a:stretch>
@@ -952,7 +1842,7 @@
           <w:color w:val="6B7280"/>
           <w:sz w:val="18"/>
         </w:rPr>
-        <w:t>Hình 7 — Đổi mật khẩu tự phục vụ</w:t>
+        <w:t>Hình 11 — Đổi mật khẩu tự phục vụ</w:t>
       </w:r>
     </w:p>
     <w:p>
@@ -977,7 +1867,7 @@
           <w:b w:val="0"/>
           <w:sz w:val="22"/>
         </w:rPr>
-        <w:t>Ngoài các chức năng của nhân sự, teamlead có thêm: chấm điểm US (hội đồng), chấm điểm cá nhân theo tháng, và đọc KPI tổng hợp / Heatmap của team.</w:t>
+        <w:t>Ngoài các chức năng của nhân sự, teamlead có thêm: DUYỆT tự chấm điểm &amp; lan tỏa của thành viên, chấm điểm US (hội đồng), đọc KPI tổng hợp / Heatmap của team, và có thể chấm điểm cá nhân trực tiếp khi cần.</w:t>
       </w:r>
     </w:p>
     <w:p>
@@ -988,7 +1878,219 @@
         <w:rPr>
           <w:color w:val="6B21A8"/>
         </w:rPr>
-        <w:t>4.1  Chấm điểm US — Hội đồng</w:t>
+        <w:t>4.1  Duyệt chấm điểm (tự chấm + lan tỏa)</w:t>
+      </w:r>
+    </w:p>
+    <w:p>
+      <w:r>
+        <w:rPr>
+          <w:b w:val="0"/>
+          <w:sz w:val="22"/>
+        </w:rPr>
+        <w:t>Đây là bước quyết định điểm KPI2/KPI3/KPI4 của thành viên: bản tự chấm chỉ được tính sau khi teamlead Duyệt.</w:t>
+      </w:r>
+    </w:p>
+    <w:tbl>
+      <w:tblPr>
+        <w:tblStyle w:val="TableGrid"/>
+        <w:tblW w:type="auto" w:w="0"/>
+        <w:jc w:val="center"/>
+        <w:tblLook w:firstColumn="1" w:firstRow="1" w:lastColumn="0" w:lastRow="0" w:noHBand="0" w:noVBand="1" w:val="04A0"/>
+      </w:tblPr>
+      <w:tblGrid>
+        <w:gridCol w:w="4320"/>
+        <w:gridCol w:w="4320"/>
+      </w:tblGrid>
+      <w:tr>
+        <w:tc>
+          <w:tcPr>
+            <w:tcW w:type="dxa" w:w="737"/>
+            <w:shd w:val="clear" w:color="auto" w:fill="6B21A8"/>
+          </w:tcPr>
+          <w:p>
+            <w:pPr>
+              <w:jc w:val="center"/>
+            </w:pPr>
+            <w:r>
+              <w:rPr>
+                <w:b/>
+                <w:color w:val="FFFFFF"/>
+                <w:sz w:val="30"/>
+              </w:rPr>
+              <w:t>1</w:t>
+            </w:r>
+          </w:p>
+        </w:tc>
+        <w:tc>
+          <w:tcPr>
+            <w:tcW w:type="dxa" w:w="4320"/>
+          </w:tcPr>
+          <w:p>
+            <w:r>
+              <w:rPr>
+                <w:b/>
+                <w:sz w:val="22"/>
+              </w:rPr>
+              <w:t>Mở "Duyệt chấm điểm"</w:t>
+              <w:br/>
+            </w:r>
+            <w:r>
+              <w:rPr>
+                <w:color w:val="6B7280"/>
+                <w:sz w:val="20"/>
+              </w:rPr>
+              <w:t>Màn hiển thị 2 nhóm: "Tự chấm KPI chờ duyệt" và "Lan tỏa AI chờ duyệt" của thành viên team bạn.</w:t>
+            </w:r>
+          </w:p>
+        </w:tc>
+      </w:tr>
+    </w:tbl>
+    <w:p/>
+    <w:tbl>
+      <w:tblPr>
+        <w:tblStyle w:val="TableGrid"/>
+        <w:tblW w:type="auto" w:w="0"/>
+        <w:jc w:val="center"/>
+        <w:tblLook w:firstColumn="1" w:firstRow="1" w:lastColumn="0" w:lastRow="0" w:noHBand="0" w:noVBand="1" w:val="04A0"/>
+      </w:tblPr>
+      <w:tblGrid>
+        <w:gridCol w:w="4320"/>
+        <w:gridCol w:w="4320"/>
+      </w:tblGrid>
+      <w:tr>
+        <w:tc>
+          <w:tcPr>
+            <w:tcW w:type="dxa" w:w="737"/>
+            <w:shd w:val="clear" w:color="auto" w:fill="6B21A8"/>
+          </w:tcPr>
+          <w:p>
+            <w:pPr>
+              <w:jc w:val="center"/>
+            </w:pPr>
+            <w:r>
+              <w:rPr>
+                <w:b/>
+                <w:color w:val="FFFFFF"/>
+                <w:sz w:val="30"/>
+              </w:rPr>
+              <w:t>2</w:t>
+            </w:r>
+          </w:p>
+        </w:tc>
+        <w:tc>
+          <w:tcPr>
+            <w:tcW w:type="dxa" w:w="4320"/>
+          </w:tcPr>
+          <w:p>
+            <w:r>
+              <w:rPr>
+                <w:b/>
+                <w:sz w:val="22"/>
+              </w:rPr>
+              <w:t>Đối chiếu &amp; quyết định</w:t>
+              <w:br/>
+            </w:r>
+            <w:r>
+              <w:rPr>
+                <w:color w:val="6B7280"/>
+                <w:sz w:val="20"/>
+              </w:rPr>
+              <w:t>Xem điểm tự chấm (KPI2 4 tiêu chí, KPI3 số khóa) và các link bằng chứng. Bấm "Duyệt" để chốt (tính vào KPI), hoặc "Từ chối" (BẮT BUỘC nhập lý do) để yêu cầu sửa lại.</w:t>
+            </w:r>
+          </w:p>
+        </w:tc>
+      </w:tr>
+    </w:tbl>
+    <w:p/>
+    <w:p>
+      <w:pPr>
+        <w:jc w:val="center"/>
+      </w:pPr>
+      <w:r>
+        <w:drawing>
+          <wp:inline xmlns:a="http://schemas.openxmlformats.org/drawingml/2006/main" xmlns:pic="http://schemas.openxmlformats.org/drawingml/2006/picture">
+            <wp:extent cx="5580000" cy="3587143"/>
+            <wp:docPr id="12" name="Picture 12"/>
+            <wp:cNvGraphicFramePr>
+              <a:graphicFrameLocks noChangeAspect="1"/>
+            </wp:cNvGraphicFramePr>
+            <a:graphic>
+              <a:graphicData uri="http://schemas.openxmlformats.org/drawingml/2006/picture">
+                <pic:pic>
+                  <pic:nvPicPr>
+                    <pic:cNvPr id="0" name="10_review_scores.png"/>
+                    <pic:cNvPicPr/>
+                  </pic:nvPicPr>
+                  <pic:blipFill>
+                    <a:blip r:embed="rId20"/>
+                    <a:stretch>
+                      <a:fillRect/>
+                    </a:stretch>
+                  </pic:blipFill>
+                  <pic:spPr>
+                    <a:xfrm>
+                      <a:off x="0" y="0"/>
+                      <a:ext cx="5580000" cy="3587143"/>
+                    </a:xfrm>
+                    <a:prstGeom prst="rect"/>
+                  </pic:spPr>
+                </pic:pic>
+              </a:graphicData>
+            </a:graphic>
+          </wp:inline>
+        </w:drawing>
+      </w:r>
+    </w:p>
+    <w:p>
+      <w:pPr>
+        <w:jc w:val="center"/>
+      </w:pPr>
+      <w:r>
+        <w:rPr>
+          <w:i/>
+          <w:color w:val="6B7280"/>
+          <w:sz w:val="18"/>
+        </w:rPr>
+        <w:t>Hình 12 — Duyệt chấm điểm: tự chấm KPI + lan tỏa chờ duyệt</w:t>
+      </w:r>
+    </w:p>
+    <w:tbl>
+      <w:tblPr>
+        <w:tblStyle w:val="TableGrid"/>
+        <w:tblW w:type="auto" w:w="0"/>
+        <w:tblLook w:firstColumn="1" w:firstRow="1" w:lastColumn="0" w:lastRow="0" w:noHBand="0" w:noVBand="1" w:val="04A0"/>
+      </w:tblPr>
+      <w:tblGrid>
+        <w:gridCol w:w="8640"/>
+      </w:tblGrid>
+      <w:tr>
+        <w:tc>
+          <w:tcPr>
+            <w:tcW w:type="dxa" w:w="8640"/>
+            <w:shd w:val="clear" w:color="auto" w:fill="EDE9FE"/>
+          </w:tcPr>
+          <w:p>
+            <w:r>
+              <w:rPr>
+                <w:color w:val="1F2537"/>
+                <w:sz w:val="20"/>
+              </w:rPr>
+              <w:t>Chỉ duyệt được thành viên thuộc team mình (hoặc team được phân công backup). Từ chối phải kèm lý do rõ ràng.</w:t>
+            </w:r>
+          </w:p>
+        </w:tc>
+      </w:tr>
+    </w:tbl>
+    <w:p/>
+    <w:p>
+      <w:pPr>
+        <w:pStyle w:val="Heading2"/>
+      </w:pPr>
+      <w:r>
+        <w:rPr>
+          <w:color w:val="6B21A8"/>
+        </w:rPr>
+        <w:t>4.2  Chấm điểm US — Hội đồng</w:t>
       </w:r>
     </w:p>
     <w:tbl>
@@ -1055,7 +2157,7 @@
         <w:drawing>
           <wp:inline xmlns:a="http://schemas.openxmlformats.org/drawingml/2006/main" xmlns:pic="http://schemas.openxmlformats.org/drawingml/2006/picture">
             <wp:extent cx="5580000" cy="3587143"/>
-            <wp:docPr id="8" name="Picture 8"/>
+            <wp:docPr id="13" name="Picture 13"/>
             <wp:cNvGraphicFramePr>
               <a:graphicFrameLocks noChangeAspect="1"/>
             </wp:cNvGraphicFramePr>
@@ -1063,11 +2165,11 @@
               <a:graphicData uri="http://schemas.openxmlformats.org/drawingml/2006/picture">
                 <pic:pic>
                   <pic:nvPicPr>
-                    <pic:cNvPr id="0" name="08_review_list.png"/>
+                    <pic:cNvPr id="0" name="11_council_list.png"/>
                     <pic:cNvPicPr/>
                   </pic:nvPicPr>
                   <pic:blipFill>
-                    <a:blip r:embed="rId16"/>
+                    <a:blip r:embed="rId21"/>
                     <a:stretch>
                       <a:fillRect/>
                     </a:stretch>
@@ -1096,7 +2198,7 @@
           <w:color w:val="6B7280"/>
           <w:sz w:val="18"/>
         </w:rPr>
-        <w:t>Hình 8 — Hàng đợi Review</w:t>
+        <w:t>Hình 13 — Hàng đợi Review</w:t>
       </w:r>
     </w:p>
     <w:tbl>
@@ -1148,7 +2250,7 @@
                 <w:color w:val="6B7280"/>
                 <w:sz w:val="20"/>
               </w:rPr>
-              <w:t>Mở 1 use case, kéo 3 thanh: Tiết kiệm thời gian (30%) · Tự động hóa (40%) · Sáng tạo (30%). Giá trị hiển thị ngay trên thanh. Xem dòng "Bằng chứng (EVD)" để đối chiếu minh chứng, rồi bấm Gửi.</w:t>
+              <w:t>Mở 1 use case, kéo 3 thanh: Tiết kiệm thời gian (30%) · Tự động hóa (40%) · Sáng tạo (30%). Xem dòng "Bằng chứng (EVD)" để đối chiếu minh chứng, rồi bấm Gửi.</w:t>
             </w:r>
           </w:p>
         </w:tc>
@@ -1163,7 +2265,7 @@
         <w:drawing>
           <wp:inline xmlns:a="http://schemas.openxmlformats.org/drawingml/2006/main" xmlns:pic="http://schemas.openxmlformats.org/drawingml/2006/picture">
             <wp:extent cx="5580000" cy="3587143"/>
-            <wp:docPr id="9" name="Picture 9"/>
+            <wp:docPr id="14" name="Picture 14"/>
             <wp:cNvGraphicFramePr>
               <a:graphicFrameLocks noChangeAspect="1"/>
             </wp:cNvGraphicFramePr>
@@ -1171,11 +2273,11 @@
               <a:graphicData uri="http://schemas.openxmlformats.org/drawingml/2006/picture">
                 <pic:pic>
                   <pic:nvPicPr>
-                    <pic:cNvPr id="0" name="09_review_panel.png"/>
+                    <pic:cNvPr id="0" name="12_council_panel.png"/>
                     <pic:cNvPicPr/>
                   </pic:nvPicPr>
                   <pic:blipFill>
-                    <a:blip r:embed="rId17"/>
+                    <a:blip r:embed="rId22"/>
                     <a:stretch>
                       <a:fillRect/>
                     </a:stretch>
@@ -1204,7 +2306,7 @@
           <w:color w:val="6B7280"/>
           <w:sz w:val="18"/>
         </w:rPr>
-        <w:t>Hình 9 — Bảng chấm điểm US hội đồng (3 tiêu chí + dòng EVD)</w:t>
+        <w:t>Hình 14 — Bảng chấm điểm US hội đồng (3 tiêu chí + dòng EVD)</w:t>
       </w:r>
     </w:p>
     <w:tbl>
@@ -1243,7 +2345,7 @@
         <w:rPr>
           <w:color w:val="6B21A8"/>
         </w:rPr>
-        <w:t>4.2  Chấm điểm cá nhân theo THÁNG</w:t>
+        <w:t>4.3  Chấm điểm cá nhân trực tiếp (song song, khi cần)</w:t>
       </w:r>
     </w:p>
     <w:p>
@@ -1252,65 +2354,29 @@
           <w:b w:val="0"/>
           <w:sz w:val="22"/>
         </w:rPr>
-        <w:t>Điểm năng lực (M-KPI-2) được chấm theo TỪNG THÁNG. Điểm cuối kỳ = trung bình các tháng đã chấm.</w:t>
+        <w:t>Màn "Chấm điểm cá nhân" (đường cũ) vẫn giữ song song: teamlead có thể tự chấm 4 tiêu chí năng lực theo tháng cho thành viên khi cần, thay vì chờ thành viên tự chấm. Kết quả cùng ghi vào KPI2 theo tháng. Khuyến nghị dùng đường "Tự chấm → Duyệt" (mục 3.5 + 4.1) làm chính để thành viên chủ động.</w:t>
       </w:r>
     </w:p>
-    <w:tbl>
-      <w:tblPr>
-        <w:tblStyle w:val="TableGrid"/>
-        <w:tblW w:type="auto" w:w="0"/>
-        <w:jc w:val="center"/>
-        <w:tblLook w:firstColumn="1" w:firstRow="1" w:lastColumn="0" w:lastRow="0" w:noHBand="0" w:noVBand="1" w:val="04A0"/>
-      </w:tblPr>
-      <w:tblGrid>
-        <w:gridCol w:w="4320"/>
-        <w:gridCol w:w="4320"/>
-      </w:tblGrid>
-      <w:tr>
-        <w:tc>
-          <w:tcPr>
-            <w:tcW w:type="dxa" w:w="737"/>
-            <w:shd w:val="clear" w:color="auto" w:fill="6B21A8"/>
-          </w:tcPr>
-          <w:p>
-            <w:pPr>
-              <w:jc w:val="center"/>
-            </w:pPr>
-            <w:r>
-              <w:rPr>
-                <w:b/>
-                <w:color w:val="FFFFFF"/>
-                <w:sz w:val="30"/>
-              </w:rPr>
-              <w:t>1</w:t>
-            </w:r>
-          </w:p>
-        </w:tc>
-        <w:tc>
-          <w:tcPr>
-            <w:tcW w:type="dxa" w:w="4320"/>
-          </w:tcPr>
-          <w:p>
-            <w:r>
-              <w:rPr>
-                <w:b/>
-                <w:sz w:val="22"/>
-              </w:rPr>
-              <w:t>Mở "Chấm điểm cá nhân"</w:t>
-              <w:br/>
-            </w:r>
-            <w:r>
-              <w:rPr>
-                <w:color w:val="6B7280"/>
-                <w:sz w:val="20"/>
-              </w:rPr>
-              <w:t>Danh sách thành viên team kèm điểm CN (trung bình các tháng) và số tháng đã chấm. Bấm "Chấm/Sửa" ở người cần chấm.</w:t>
-            </w:r>
-          </w:p>
-        </w:tc>
-      </w:tr>
-    </w:tbl>
-    <w:p/>
+    <w:p>
+      <w:pPr>
+        <w:pStyle w:val="Heading2"/>
+      </w:pPr>
+      <w:r>
+        <w:rPr>
+          <w:color w:val="6B21A8"/>
+        </w:rPr>
+        <w:t>4.4  Đọc KPI tổng hợp &amp; Heatmap</w:t>
+      </w:r>
+    </w:p>
+    <w:p>
+      <w:r>
+        <w:rPr>
+          <w:b w:val="0"/>
+          <w:sz w:val="22"/>
+        </w:rPr>
+        <w:t>Trên Leaderboard, tab "KPI tổng hợp" / "KPI Teamlead" thể hiện điểm cuối; tab "Heatmap" hiển thị lưới team × cá nhân theo màu (xanh ≥85 · xanh lá ≥70 · vàng 50–69 · đỏ &lt;50).</w:t>
+      </w:r>
+    </w:p>
     <w:p>
       <w:pPr>
         <w:jc w:val="center"/>
@@ -1319,7 +2385,7 @@
         <w:drawing>
           <wp:inline xmlns:a="http://schemas.openxmlformats.org/drawingml/2006/main" xmlns:pic="http://schemas.openxmlformats.org/drawingml/2006/picture">
             <wp:extent cx="5580000" cy="3587143"/>
-            <wp:docPr id="10" name="Picture 10"/>
+            <wp:docPr id="15" name="Picture 15"/>
             <wp:cNvGraphicFramePr>
               <a:graphicFrameLocks noChangeAspect="1"/>
             </wp:cNvGraphicFramePr>
@@ -1327,11 +2393,11 @@
               <a:graphicData uri="http://schemas.openxmlformats.org/drawingml/2006/picture">
                 <pic:pic>
                   <pic:nvPicPr>
-                    <pic:cNvPr id="0" name="06_personal_list.png"/>
+                    <pic:cNvPr id="0" name="14_heatmap.png"/>
                     <pic:cNvPicPr/>
                   </pic:nvPicPr>
                   <pic:blipFill>
-                    <a:blip r:embed="rId18"/>
+                    <a:blip r:embed="rId23"/>
                     <a:stretch>
                       <a:fillRect/>
                     </a:stretch>
@@ -1360,271 +2426,7 @@
           <w:color w:val="6B7280"/>
           <w:sz w:val="18"/>
         </w:rPr>
-        <w:t>Hình 10 — Danh sách chấm điểm cá nhân</w:t>
-      </w:r>
-    </w:p>
-    <w:tbl>
-      <w:tblPr>
-        <w:tblStyle w:val="TableGrid"/>
-        <w:tblW w:type="auto" w:w="0"/>
-        <w:jc w:val="center"/>
-        <w:tblLook w:firstColumn="1" w:firstRow="1" w:lastColumn="0" w:lastRow="0" w:noHBand="0" w:noVBand="1" w:val="04A0"/>
-      </w:tblPr>
-      <w:tblGrid>
-        <w:gridCol w:w="4320"/>
-        <w:gridCol w:w="4320"/>
-      </w:tblGrid>
-      <w:tr>
-        <w:tc>
-          <w:tcPr>
-            <w:tcW w:type="dxa" w:w="737"/>
-            <w:shd w:val="clear" w:color="auto" w:fill="6B21A8"/>
-          </w:tcPr>
-          <w:p>
-            <w:pPr>
-              <w:jc w:val="center"/>
-            </w:pPr>
-            <w:r>
-              <w:rPr>
-                <w:b/>
-                <w:color w:val="FFFFFF"/>
-                <w:sz w:val="30"/>
-              </w:rPr>
-              <w:t>2</w:t>
-            </w:r>
-          </w:p>
-        </w:tc>
-        <w:tc>
-          <w:tcPr>
-            <w:tcW w:type="dxa" w:w="4320"/>
-          </w:tcPr>
-          <w:p>
-            <w:r>
-              <w:rPr>
-                <w:b/>
-                <w:sz w:val="22"/>
-              </w:rPr>
-              <w:t>Chọn kỳ (tháng) &amp; chấm 4 tiêu chí</w:t>
-              <w:br/>
-            </w:r>
-            <w:r>
-              <w:rPr>
-                <w:color w:val="6B7280"/>
-                <w:sz w:val="20"/>
-              </w:rPr>
-              <w:t>Trong bảng chấm, chọn "Kỳ chấm (tháng)". Tháng chưa chấm mặc định 0; tháng đã chấm hiển thị điểm cũ để sửa. Kéo 4 thanh: Đa dạng 30% · Thành thạo AI 20% · Chất lượng SP 30% · Số lượng đủ 20%.</w:t>
-            </w:r>
-          </w:p>
-        </w:tc>
-      </w:tr>
-    </w:tbl>
-    <w:p/>
-    <w:tbl>
-      <w:tblPr>
-        <w:tblStyle w:val="TableGrid"/>
-        <w:tblW w:type="auto" w:w="0"/>
-        <w:jc w:val="center"/>
-        <w:tblLook w:firstColumn="1" w:firstRow="1" w:lastColumn="0" w:lastRow="0" w:noHBand="0" w:noVBand="1" w:val="04A0"/>
-      </w:tblPr>
-      <w:tblGrid>
-        <w:gridCol w:w="4320"/>
-        <w:gridCol w:w="4320"/>
-      </w:tblGrid>
-      <w:tr>
-        <w:tc>
-          <w:tcPr>
-            <w:tcW w:type="dxa" w:w="737"/>
-            <w:shd w:val="clear" w:color="auto" w:fill="6B21A8"/>
-          </w:tcPr>
-          <w:p>
-            <w:pPr>
-              <w:jc w:val="center"/>
-            </w:pPr>
-            <w:r>
-              <w:rPr>
-                <w:b/>
-                <w:color w:val="FFFFFF"/>
-                <w:sz w:val="30"/>
-              </w:rPr>
-              <w:t>3</w:t>
-            </w:r>
-          </w:p>
-        </w:tc>
-        <w:tc>
-          <w:tcPr>
-            <w:tcW w:type="dxa" w:w="4320"/>
-          </w:tcPr>
-          <w:p>
-            <w:r>
-              <w:rPr>
-                <w:b/>
-                <w:sz w:val="22"/>
-              </w:rPr>
-              <w:t>Xem các nhóm điểm &amp; lưu</w:t>
-              <w:br/>
-            </w:r>
-            <w:r>
-              <w:rPr>
-                <w:color w:val="6B7280"/>
-                <w:sz w:val="20"/>
-              </w:rPr>
-              <w:t>Bảng hiển thị rõ: M-KPI-1 (điểm US do hội đồng chấm — chỉ xem) · M-KPI-2 (bạn chấm) · KPI khác (khóa học/lan tỏa/điểm trừ) · KPI tổng hợp dự kiến · dòng EVD. Bấm "Lưu điểm tháng này".</w:t>
-            </w:r>
-          </w:p>
-        </w:tc>
-      </w:tr>
-    </w:tbl>
-    <w:p/>
-    <w:p>
-      <w:pPr>
-        <w:jc w:val="center"/>
-      </w:pPr>
-      <w:r>
-        <w:drawing>
-          <wp:inline xmlns:a="http://schemas.openxmlformats.org/drawingml/2006/main" xmlns:pic="http://schemas.openxmlformats.org/drawingml/2006/picture">
-            <wp:extent cx="5580000" cy="3587143"/>
-            <wp:docPr id="11" name="Picture 11"/>
-            <wp:cNvGraphicFramePr>
-              <a:graphicFrameLocks noChangeAspect="1"/>
-            </wp:cNvGraphicFramePr>
-            <a:graphic>
-              <a:graphicData uri="http://schemas.openxmlformats.org/drawingml/2006/picture">
-                <pic:pic>
-                  <pic:nvPicPr>
-                    <pic:cNvPr id="0" name="07_personal_panel.png"/>
-                    <pic:cNvPicPr/>
-                  </pic:nvPicPr>
-                  <pic:blipFill>
-                    <a:blip r:embed="rId19"/>
-                    <a:stretch>
-                      <a:fillRect/>
-                    </a:stretch>
-                  </pic:blipFill>
-                  <pic:spPr>
-                    <a:xfrm>
-                      <a:off x="0" y="0"/>
-                      <a:ext cx="5580000" cy="3587143"/>
-                    </a:xfrm>
-                    <a:prstGeom prst="rect"/>
-                  </pic:spPr>
-                </pic:pic>
-              </a:graphicData>
-            </a:graphic>
-          </wp:inline>
-        </w:drawing>
-      </w:r>
-    </w:p>
-    <w:p>
-      <w:pPr>
-        <w:jc w:val="center"/>
-      </w:pPr>
-      <w:r>
-        <w:rPr>
-          <w:i/>
-          <w:color w:val="6B7280"/>
-          <w:sz w:val="18"/>
-        </w:rPr>
-        <w:t>Hình 11 — Bảng chấm điểm cá nhân theo tháng (nhóm điểm rõ + thanh kéo hiển thị giá trị + EVD)</w:t>
-      </w:r>
-    </w:p>
-    <w:tbl>
-      <w:tblPr>
-        <w:tblStyle w:val="TableGrid"/>
-        <w:tblW w:type="auto" w:w="0"/>
-        <w:tblLook w:firstColumn="1" w:firstRow="1" w:lastColumn="0" w:lastRow="0" w:noHBand="0" w:noVBand="1" w:val="04A0"/>
-      </w:tblPr>
-      <w:tblGrid>
-        <w:gridCol w:w="8640"/>
-      </w:tblGrid>
-      <w:tr>
-        <w:tc>
-          <w:tcPr>
-            <w:tcW w:type="dxa" w:w="8640"/>
-            <w:shd w:val="clear" w:color="auto" w:fill="D1FAE5"/>
-          </w:tcPr>
-          <w:p>
-            <w:r>
-              <w:rPr>
-                <w:color w:val="1F2537"/>
-                <w:sz w:val="20"/>
-              </w:rPr>
-              <w:t>Khóa học / lan tỏa / số milestone chậm chỉ cần nhập 1 lần (hệ thống lấy giá trị mới nhất). Riêng 4 tiêu chí năng lực được chấm &amp; lưu theo từng tháng.</w:t>
-            </w:r>
-          </w:p>
-        </w:tc>
-      </w:tr>
-    </w:tbl>
-    <w:p/>
-    <w:p>
-      <w:pPr>
-        <w:pStyle w:val="Heading2"/>
-      </w:pPr>
-      <w:r>
-        <w:rPr>
-          <w:color w:val="6B21A8"/>
-        </w:rPr>
-        <w:t>4.3  Đọc KPI tổng hợp &amp; Heatmap</w:t>
-      </w:r>
-    </w:p>
-    <w:p>
-      <w:r>
-        <w:rPr>
-          <w:b w:val="0"/>
-          <w:sz w:val="22"/>
-        </w:rPr>
-        <w:t>Trên Leaderboard, tab "KPI tổng hợp" và "KPI Teamlead" thể hiện điểm cuối; tab "Heatmap" hiển thị lưới team × cá nhân theo màu (xanh ≥85 · xanh lá ≥70 · vàng 50–69 · đỏ &lt;50).</w:t>
-      </w:r>
-    </w:p>
-    <w:p>
-      <w:pPr>
-        <w:jc w:val="center"/>
-      </w:pPr>
-      <w:r>
-        <w:drawing>
-          <wp:inline xmlns:a="http://schemas.openxmlformats.org/drawingml/2006/main" xmlns:pic="http://schemas.openxmlformats.org/drawingml/2006/picture">
-            <wp:extent cx="5580000" cy="3587143"/>
-            <wp:docPr id="12" name="Picture 12"/>
-            <wp:cNvGraphicFramePr>
-              <a:graphicFrameLocks noChangeAspect="1"/>
-            </wp:cNvGraphicFramePr>
-            <a:graphic>
-              <a:graphicData uri="http://schemas.openxmlformats.org/drawingml/2006/picture">
-                <pic:pic>
-                  <pic:nvPicPr>
-                    <pic:cNvPr id="0" name="11_leaderboard_heatmap.png"/>
-                    <pic:cNvPicPr/>
-                  </pic:nvPicPr>
-                  <pic:blipFill>
-                    <a:blip r:embed="rId20"/>
-                    <a:stretch>
-                      <a:fillRect/>
-                    </a:stretch>
-                  </pic:blipFill>
-                  <pic:spPr>
-                    <a:xfrm>
-                      <a:off x="0" y="0"/>
-                      <a:ext cx="5580000" cy="3587143"/>
-                    </a:xfrm>
-                    <a:prstGeom prst="rect"/>
-                  </pic:spPr>
-                </pic:pic>
-              </a:graphicData>
-            </a:graphic>
-          </wp:inline>
-        </w:drawing>
-      </w:r>
-    </w:p>
-    <w:p>
-      <w:pPr>
-        <w:jc w:val="center"/>
-      </w:pPr>
-      <w:r>
-        <w:rPr>
-          <w:i/>
-          <w:color w:val="6B7280"/>
-          <w:sz w:val="18"/>
-        </w:rPr>
-        <w:t>Hình 12 — Heatmap KPI team &amp; cá nhân (kèm thẻ KPI PM)</w:t>
+        <w:t>Hình 15 — Heatmap KPI team &amp; cá nhân (kèm thẻ KPI PM)</w:t>
       </w:r>
     </w:p>
     <w:p>
@@ -1709,7 +2511,7 @@
                 <w:color w:val="FFFFFF"/>
                 <w:sz w:val="20"/>
               </w:rPr>
-              <w:t>Người chấm</w:t>
+              <w:t>Nguồn chấm</w:t>
             </w:r>
           </w:p>
         </w:tc>
@@ -1740,7 +2542,7 @@
               <w:rPr>
                 <w:sz w:val="19"/>
               </w:rPr>
-              <w:t>M-KPI-1 — Điểm US</w:t>
+              <w:t>KPI-1 — Điểm US</w:t>
             </w:r>
           </w:p>
         </w:tc>
@@ -1766,7 +2568,7 @@
               <w:rPr>
                 <w:sz w:val="19"/>
               </w:rPr>
-              <w:t>Hội đồng (4 teamlead)</w:t>
+              <w:t>Hội đồng (teamlead)</w:t>
             </w:r>
           </w:p>
         </w:tc>
@@ -1794,7 +2596,7 @@
               <w:rPr>
                 <w:sz w:val="19"/>
               </w:rPr>
-              <w:t>M-KPI-2 — Năng lực</w:t>
+              <w:t>KPI-2 — Năng lực</w:t>
             </w:r>
           </w:p>
         </w:tc>
@@ -1820,7 +2622,7 @@
               <w:rPr>
                 <w:sz w:val="19"/>
               </w:rPr>
-              <w:t>Teamlead (theo tháng)</w:t>
+              <w:t>Member tự chấm → Teamlead duyệt</w:t>
             </w:r>
           </w:p>
         </w:tc>
@@ -1833,7 +2635,7 @@
               <w:rPr>
                 <w:sz w:val="19"/>
               </w:rPr>
-              <w:t>Trung bình các tháng đã chấm (4 tiêu chí)</w:t>
+              <w:t>Trung bình các tháng đã duyệt (4 tiêu chí 0–10)</w:t>
             </w:r>
           </w:p>
         </w:tc>
@@ -1848,7 +2650,7 @@
               <w:rPr>
                 <w:sz w:val="19"/>
               </w:rPr>
-              <w:t>M-KPI-3 — Khóa học</w:t>
+              <w:t>KPI-3 — Khóa học</w:t>
             </w:r>
           </w:p>
         </w:tc>
@@ -1874,7 +2676,7 @@
               <w:rPr>
                 <w:sz w:val="19"/>
               </w:rPr>
-              <w:t>Teamlead</w:t>
+              <w:t>Member khai → Teamlead duyệt</w:t>
             </w:r>
           </w:p>
         </w:tc>
@@ -1902,7 +2704,7 @@
               <w:rPr>
                 <w:sz w:val="19"/>
               </w:rPr>
-              <w:t>M-KPI-4 — Lan tỏa</w:t>
+              <w:t>KPI-4 — Lan tỏa</w:t>
             </w:r>
           </w:p>
         </w:tc>
@@ -1928,7 +2730,7 @@
               <w:rPr>
                 <w:sz w:val="19"/>
               </w:rPr>
-              <w:t>Teamlead / tự động</w:t>
+              <w:t>Member khai/duyệt HOẶC tự động</w:t>
             </w:r>
           </w:p>
         </w:tc>
@@ -1941,7 +2743,7 @@
               <w:rPr>
                 <w:sz w:val="19"/>
               </w:rPr>
-              <w:t>Đạt = có buổi chia sẻ HOẶC ≥3 người tái dùng UC</w:t>
+              <w:t>Đạt = được duyệt buổi chia sẻ HOẶC ≥3 người tái dùng UC</w:t>
             </w:r>
           </w:p>
         </w:tc>
@@ -1982,7 +2784,7 @@
               <w:rPr>
                 <w:sz w:val="19"/>
               </w:rPr>
-              <w:t>Teamlead</w:t>
+              <w:t>Hệ thống/Teamlead</w:t>
             </w:r>
           </w:p>
         </w:tc>
@@ -2259,7 +3061,7 @@
                 <w:color w:val="1F2537"/>
                 <w:sz w:val="20"/>
               </w:rPr>
-              <w:t>Teamlead KPI = 60% KPI cá nhân của teamlead + 40% tỷ lệ thành viên team đạt ≥ 70 điểm.</w:t>
+              <w:t>Teamlead KPI = 60% KPI cá nhân của teamlead + 40% tỷ lệ thành viên team đạt ≥ 70 điểm. Điểm KPI-2/KPI-3 chỉ vào công thức SAU khi teamlead duyệt bản tự chấm.</w:t>
             </w:r>
           </w:p>
         </w:tc>
@@ -2284,7 +3086,7 @@
           <w:color w:val="6B21A8"/>
           <w:sz w:val="21"/>
         </w:rPr>
-        <w:t>• Không thấy Workflow trong danh mục khi đăng ký?</w:t>
+        <w:t>• Đăng ký US sao không thấy ô nhập prompt/demo?</w:t>
       </w:r>
     </w:p>
     <w:p>
@@ -2294,7 +3096,7 @@
           <w:color w:val="1F2537"/>
           <w:sz w:val="20"/>
         </w:rPr>
-        <w:t xml:space="preserve">   Chọn "Khác — nhập tự do" để nhập Use Case mới; hoặc báo admin bổ sung Workflow vào danh mục.</w:t>
+        <w:t xml:space="preserve">   Đăng ký nay tối giản (chỉ Workflow/US + kế hoạch T9–T12). Prompt, luồng AI và demo bổ sung sau ở màn "Cập nhật US".</w:t>
       </w:r>
     </w:p>
     <w:p>
@@ -2304,7 +3106,7 @@
           <w:color w:val="6B21A8"/>
           <w:sz w:val="21"/>
         </w:rPr>
-        <w:t>• Điểm cá nhân của tôi thấp vì mới chấm 1 tháng?</w:t>
+        <w:t>• Tự chấm KPI xong sao điểm chưa lên?</w:t>
       </w:r>
     </w:p>
     <w:p>
@@ -2314,7 +3116,7 @@
           <w:color w:val="1F2537"/>
           <w:sz w:val="20"/>
         </w:rPr>
-        <w:t xml:space="preserve">   Điểm cuối kỳ là trung bình các tháng ĐÃ chấm — tháng chưa chấm không bị tính 0. Điểm sẽ phản ánh dần theo các tháng.</w:t>
+        <w:t xml:space="preserve">   Điểm KPI-2/KPI-3 chỉ tính SAU khi teamlead bấm "Duyệt". Trước đó bản tự chấm ở trạng thái "Chờ duyệt".</w:t>
       </w:r>
     </w:p>
     <w:p>
@@ -2324,7 +3126,7 @@
           <w:color w:val="6B21A8"/>
           <w:sz w:val="21"/>
         </w:rPr>
-        <w:t>• Teamlead chấm nhầm tháng thì sao?</w:t>
+        <w:t>• Bị teamlead từ chối bản tự chấm?</w:t>
       </w:r>
     </w:p>
     <w:p>
@@ -2334,7 +3136,7 @@
           <w:color w:val="1F2537"/>
           <w:sz w:val="20"/>
         </w:rPr>
-        <w:t xml:space="preserve">   Mở lại người đó, chọn đúng tháng và chấm lại — hệ thống ghi đè điểm của tháng đó.</w:t>
+        <w:t xml:space="preserve">   Mở lại "Tự chấm KPI", đọc lý do từ chối, sửa số/bằng chứng rồi Nộp lại. Mỗi tháng nộp 1 lần, khóa sau khi được Duyệt.</w:t>
       </w:r>
     </w:p>
     <w:p>
@@ -2344,7 +3146,7 @@
           <w:color w:val="6B21A8"/>
           <w:sz w:val="21"/>
         </w:rPr>
-        <w:t>• Dòng EVD để làm gì?</w:t>
+        <w:t>• "Bài tập AI" có tính điểm không?</w:t>
       </w:r>
     </w:p>
     <w:p>
@@ -2354,7 +3156,47 @@
           <w:color w:val="1F2537"/>
           <w:sz w:val="20"/>
         </w:rPr>
-        <w:t xml:space="preserve">   Là link minh chứng (ổ share) để đối chiếu khi chấm; hiện chỉ hiển thị, không chỉnh sửa tại màn chấm.</w:t>
+        <w:t xml:space="preserve">   Không. Đây là kênh chia sẻ thao tác nhỏ để lan tỏa; không tính vào KPI.</w:t>
+      </w:r>
+    </w:p>
+    <w:p>
+      <w:r>
+        <w:rPr>
+          <w:b/>
+          <w:color w:val="6B21A8"/>
+          <w:sz w:val="21"/>
+        </w:rPr>
+        <w:t>• US H1 khác US H2 thế nào?</w:t>
+      </w:r>
+    </w:p>
+    <w:p>
+      <w:r>
+        <w:rPr>
+          <w:b w:val="0"/>
+          <w:color w:val="1F2537"/>
+          <w:sz w:val="20"/>
+        </w:rPr>
+        <w:t xml:space="preserve">   "US H1" chỉ để tra cứu (chỉ đọc) use case kỳ H1; không liên quan KPI/chấm điểm H2 hiện hành.</w:t>
+      </w:r>
+    </w:p>
+    <w:p>
+      <w:r>
+        <w:rPr>
+          <w:b/>
+          <w:color w:val="6B21A8"/>
+          <w:sz w:val="21"/>
+        </w:rPr>
+        <w:t>• Lan tỏa (KPI-4) đạt bằng cách nào?</w:t>
+      </w:r>
+    </w:p>
+    <w:p>
+      <w:r>
+        <w:rPr>
+          <w:b w:val="0"/>
+          <w:color w:val="1F2537"/>
+          <w:sz w:val="20"/>
+        </w:rPr>
+        <w:t xml:space="preserve">   Hai đường song song: (a) khai buổi chia sẻ + bằng chứng → teamlead duyệt; hoặc (b) tự động khi ≥3 người xác nhận tái dùng UC của bạn ở Thư viện.</w:t>
       </w:r>
     </w:p>
     <w:sectPr>

</xml_diff>